<commit_message>
Retire four 0_utils skills; PROBE becomes EVIDENCE across board/page/paper
Removes diagram-ascii-canvas, diagram-drawio, haipipe-run-timeline and
haipipe-skill-diagnose, and trims diagram-excalidraw. Renames the
Q-consumer answer-filling phase from PROBE to EVIDENCE through the
board, page, page-workflows, page-plugins and agents skills, and bumps
the venue submodule for the same rename in its 95 templates. Rebuilds
the subjective-label plugin board render.

Co-Authored-By: Claude Opus 5 (1M context) <noreply@anthropic.com>
</commit_message>
<xml_diff>
--- a/plugins/haipipe-toolkit/skills/diagrams/BoardSkillBoard-260722/4-QPf-page-folder/QPf2-draw-attach/word/QPf2-draw-attach.docx
+++ b/plugins/haipipe-toolkit/skills/diagrams/BoardSkillBoard-260722/4-QPf-page-folder/QPf2-draw-attach/word/QPf2-draw-attach.docx
@@ -4,10 +4,18 @@
   <w:body>
     <w:p>
       <w:pPr>
-        <w:pStyle w:val="Heading1"/>
-      </w:pPr>
-      <w:r>
-        <w:t xml:space="preserve">1 · Where a drawing lives</w:t>
+        <w:pStyle w:val="Title"/>
+      </w:pPr>
+      <w:r>
+        <w:t xml:space="preserve">Draw · every page keeps its own drawing</w:t>
+      </w:r>
+    </w:p>
+    <w:p>
+      <w:pPr>
+        <w:pStyle w:val="Heading1"/>
+      </w:pPr>
+      <w:r>
+        <w:t xml:space="preserve">1 · Every drawing has one file, and one owner</w:t>
       </w:r>
     </w:p>
     <w:p>
@@ -18,15 +26,15 @@
         <w:t xml:space="preserve">The files</w:t>
       </w:r>
       <w:r>
-        <w:t xml:space="preserve">: one scene per owner, each in its owner's folder. Each page drawing is an ordinary Excalidraw file that is useful opened by itself. A page that has no drawing yet gets an empty scene created the first time its Draw split opens, so there is never a missing file to trip over. The group drawing holds only group-level layout and an import list naming each page's scene; it never copies their content.</w:t>
-      </w:r>
-    </w:p>
-    <w:p>
-      <w:pPr>
-        <w:pStyle w:val="Heading1"/>
-      </w:pPr>
-      <w:r>
-        <w:t xml:space="preserve">2 · Opening, editing, and generating</w:t>
+        <w:t xml:space="preserve">: one drawing per owner, each in its owner's folder. 📌 This part says which file holds which drawing, so you always know what to open. The two page names in that list are different on purpose. The folder is named for the page id plus its slug. The scene file is named for the page id alone. This page sits in QPf2-draw-attach/ and its scene is draw/QPf2.excalidraw. Each page drawing is a plain Excalidraw file, and it is still useful opened on its own. A pasted image is saved under the owner's draw/assets/, and the scene keeps a relative path to it. A page with no drawing yet gets an empty scene the first time its Draw split opens. So there is never a missing file to trip over. The group drawing holds only the group's own layout and a list naming each page's scene. It never copies what those scenes contain. board.excalidraw stays at the board root as the Index page's overview map. Everything below it follows the new layout: one scene per page, one per group.</w:t>
+      </w:r>
+    </w:p>
+    <w:p>
+      <w:pPr>
+        <w:pStyle w:val="Heading1"/>
+      </w:pPr>
+      <w:r>
+        <w:t xml:space="preserve">2 · You draw beside the page, never inside it</w:t>
       </w:r>
     </w:p>
     <w:p>
@@ -37,15 +45,15 @@
         <w:t xml:space="preserve">The Draw split</w:t>
       </w:r>
       <w:r>
-        <w:t xml:space="preserve">: the drawing opens beside the page, never inside it. The split shows which file it saves to before you draw, so a gesture can never land in another page's scene. The Draw-it button takes an optional ask; left empty, it draws the page's ascii figure as a real scene. A generated scene may be regenerated freely, but the button refuses to overwrite a drawing a person made by hand.</w:t>
-      </w:r>
-    </w:p>
-    <w:p>
-      <w:pPr>
-        <w:pStyle w:val="Heading1"/>
-      </w:pPr>
-      <w:r>
-        <w:t xml:space="preserve">3 · The group view is composed, never copied</w:t>
+        <w:t xml:space="preserve">: the drawing opens next to the page, never inside it. 📌 This part says how to open a drawing, how to edit it, and how to ask Claude to draw it for you. The split names the file it will save to before you draw. So a stroke can never land in another page's scene. The Draw-it button takes an optional ask. Leave it empty, and it turns the page's ascii figure into a real drawing. A drawing Claude made can be drawn again as often as you like. The button refuses to overwrite a drawing a person made by hand.</w:t>
+      </w:r>
+    </w:p>
+    <w:p>
+      <w:pPr>
+        <w:pStyle w:val="Heading1"/>
+      </w:pPr>
+      <w:r>
+        <w:t xml:space="preserve">3 · The big group picture is built from the page files, not copied from them</w:t>
       </w:r>
     </w:p>
     <w:p>
@@ -56,15 +64,15 @@
         <w:t xml:space="preserve">One large drawing from many small ones</w:t>
       </w:r>
       <w:r>
-        <w:t xml:space="preserve">: what is stored and what is derived. Opening a group's drawing loads the group scene, pulls in every member page's scene, and places them by the stored layout. Editing inside the composed view happens in one visible mode at a time: arrange the pages, edit the group's own layer, or enter one page's scene; only that owner's file receives the save. A page save updates the composed view on its next open; nothing is ever merged or imported by hand.</w:t>
-      </w:r>
-    </w:p>
-    <w:p>
-      <w:pPr>
-        <w:pStyle w:val="Heading1"/>
-      </w:pPr>
-      <w:r>
-        <w:t xml:space="preserve">4 · Saves are checked, never blind</w:t>
+        <w:t xml:space="preserve">: what is kept, and what is built for you. 📌 This part says the group picture is put together from the page files each time it opens. Opening a group's drawing loads the group scene, pulls in every member page's scene, and places them where the layout says. Inside the group view you work in one mode at a time. You can arrange the pages, edit the group's own layer, or step into one page's scene. Only that owner's file receives the save. Save a page, and the group view shows the change the next time it opens. Nothing is ever merged or pulled in by hand.</w:t>
+      </w:r>
+    </w:p>
+    <w:p>
+      <w:pPr>
+        <w:pStyle w:val="Heading1"/>
+      </w:pPr>
+      <w:r>
+        <w:t xml:space="preserve">4 · Two people cannot wipe out each other's work</w:t>
       </w:r>
     </w:p>
     <w:p>
@@ -75,7 +83,7 @@
         <w:t xml:space="preserve">The safe save</w:t>
       </w:r>
       <w:r>
-        <w:t xml:space="preserve">: what the server verifies before writing. Every save carries the revision it started from, so two people editing the same drawing cannot silently overwrite each other. The chat pane receives the same owner address as the canvas, so asking it to change a drawing routes to that drawing's own file.</w:t>
+        <w:t xml:space="preserve">: what the server checks before it writes. 📌 This part says every save is checked first, so nobody quietly loses work. Every save carries the version it started from. So two people on the same drawing cannot quietly overwrite each other. The chat pane gets the same owner address as the canvas. So asking chat to change a drawing writes to that drawing's own file.</w:t>
       </w:r>
     </w:p>
     <w:sectPr>
@@ -127,6 +135,19 @@
       <w:sz w:val="24"/>
     </w:rPr>
   </w:style>
+  <w:style w:type="paragraph" w:styleId="Title">
+    <w:name w:val="Title"/>
+    <w:pPr>
+      <w:keepNext/>
+      <w:spacing w:before="0" w:after="360" w:line="300" w:lineRule="auto"/>
+      <w:jc w:val="center"/>
+    </w:pPr>
+    <w:rPr>
+      <w:rFonts w:ascii="Times New Roman" w:hAnsi="Times New Roman"/>
+      <w:b/>
+      <w:sz w:val="32"/>
+    </w:rPr>
+  </w:style>
   <w:style w:type="paragraph" w:styleId="Heading2">
     <w:name w:val="heading 2"/>
     <w:pPr>

</xml_diff>